<commit_message>
fixed data merging error and reran analysis
</commit_message>
<xml_diff>
--- a/GRB T90 Duration Variance Test.docx
+++ b/GRB T90 Duration Variance Test.docx
@@ -14,257 +14,1029 @@
           <w:b/>
           <w:bCs/>
         </w:rPr>
-        <w:t>GRB T90 Duration Variance Test (June 2026)</w:t>
-      </w:r>
-    </w:p>
-    <w:p>
-      <w:r>
-        <w:rPr>
-          <w:b/>
-          <w:bCs/>
-        </w:rPr>
-        <w:t>Prediction tested</w:t>
-      </w:r>
-      <w:r>
-        <w:t xml:space="preserve">: If causality is emergent from temporal coherence, and coherence was stronger in the denser early universe, then the </w:t>
-      </w:r>
-      <w:r>
-        <w:rPr>
-          <w:b/>
-          <w:bCs/>
-        </w:rPr>
-        <w:t>intrinsic scatter (variance/jitter)</w:t>
-      </w:r>
-      <w:r>
-        <w:t xml:space="preserve"> in time-dilation corrected GRB durations should be </w:t>
-      </w:r>
-      <w:r>
-        <w:rPr>
-          <w:b/>
-          <w:bCs/>
-        </w:rPr>
-        <w:t>lower at high redshift</w:t>
-      </w:r>
-      <w:r>
-        <w:t xml:space="preserve"> (earlier cosmic epochs) compared to the recent universe.</w:t>
-      </w:r>
-    </w:p>
-    <w:p>
-      <w:r>
-        <w:rPr>
-          <w:b/>
-          <w:bCs/>
-        </w:rPr>
-        <w:t>Method</w:t>
-      </w:r>
-      <w:r>
-        <w:t>:</w:t>
+        <w:t>GRB Duration Variance Test Using Cleaned Redshift Catalog</w:t>
+      </w:r>
+    </w:p>
+    <w:p>
+      <w:pPr>
+        <w:rPr>
+          <w:b/>
+          <w:bCs/>
+        </w:rPr>
+      </w:pPr>
+      <w:r>
+        <w:rPr>
+          <w:b/>
+          <w:bCs/>
+        </w:rPr>
+        <w:t>Temporal Emergence / Temporal Coherence Gravity Investigation</w:t>
+      </w:r>
+    </w:p>
+    <w:p>
+      <w:r>
+        <w:rPr>
+          <w:b/>
+          <w:bCs/>
+        </w:rPr>
+        <w:t>Date:</w:t>
+      </w:r>
+      <w:r>
+        <w:t xml:space="preserve"> June 2026</w:t>
+      </w:r>
+    </w:p>
+    <w:p>
+      <w:pPr>
+        <w:rPr>
+          <w:b/>
+          <w:bCs/>
+        </w:rPr>
+      </w:pPr>
+      <w:r>
+        <w:rPr>
+          <w:b/>
+          <w:bCs/>
+        </w:rPr>
+        <w:t>Objective</w:t>
+      </w:r>
+    </w:p>
+    <w:p>
+      <w:r>
+        <w:t>Test whether the statistical spread of intrinsic Gamma Ray Burst (GRB) durations changes with cosmic epoch.</w:t>
+      </w:r>
+    </w:p>
+    <w:p>
+      <w:r>
+        <w:t>Under the Temporal Coherence Gravity (TCG) hypothesis, causality emerges from an underlying coherence structure. If coherence was stronger in the denser early universe, then astrophysical events occurring at high redshift should exhibit reduced intrinsic timing variability compared to similar events in the more recent universe.</w:t>
+      </w:r>
+    </w:p>
+    <w:p>
+      <w:r>
+        <w:t>The prediction is therefore:</w:t>
+      </w:r>
+    </w:p>
+    <w:p>
+      <w:r>
+        <w:rPr>
+          <w:b/>
+          <w:bCs/>
+        </w:rPr>
+        <w:t>Higher redshift (earlier universe) → stronger coherence → lower variance in corrected GRB durations.</w:t>
+      </w:r>
+    </w:p>
+    <w:p>
+      <w:r>
+        <w:pict w14:anchorId="79B0CB64">
+          <v:rect id="_x0000_i1151" style="width:0;height:1.5pt" o:hralign="center" o:hrstd="t" o:hr="t" fillcolor="#a0a0a0" stroked="f"/>
+        </w:pict>
+      </w:r>
+    </w:p>
+    <w:p>
+      <w:pPr>
+        <w:rPr>
+          <w:b/>
+          <w:bCs/>
+        </w:rPr>
+      </w:pPr>
+      <w:r>
+        <w:rPr>
+          <w:b/>
+          <w:bCs/>
+        </w:rPr>
+        <w:t>Data Sources</w:t>
       </w:r>
     </w:p>
     <w:p>
       <w:pPr>
         <w:numPr>
           <w:ilvl w:val="0"/>
-          <w:numId w:val="1"/>
+          <w:numId w:val="4"/>
         </w:numPr>
       </w:pPr>
       <w:r>
-        <w:t>Used Swift BAT GRB catalog + compiled redshift list</w:t>
+        <w:t>Swift BAT GRB Catalog</w:t>
       </w:r>
     </w:p>
     <w:p>
       <w:pPr>
         <w:numPr>
           <w:ilvl w:val="0"/>
-          <w:numId w:val="1"/>
+          <w:numId w:val="4"/>
         </w:numPr>
       </w:pPr>
       <w:r>
-        <w:t>Computed T90_corr = T90 / (1 + z)</w:t>
+        <w:t>BAT-detected GRB Redshift Compilation</w:t>
       </w:r>
     </w:p>
     <w:p>
       <w:pPr>
         <w:numPr>
           <w:ilvl w:val="0"/>
-          <w:numId w:val="1"/>
+          <w:numId w:val="4"/>
         </w:numPr>
       </w:pPr>
       <w:r>
-        <w:t>Binned by redshift and measured standard deviation + variance of corrected durations</w:t>
+        <w:t>Merged and cleaned dataset containing:</w:t>
+      </w:r>
+    </w:p>
+    <w:p>
+      <w:pPr>
+        <w:numPr>
+          <w:ilvl w:val="1"/>
+          <w:numId w:val="4"/>
+        </w:numPr>
+      </w:pPr>
+      <w:r>
+        <w:t>GRB identifier</w:t>
+      </w:r>
+    </w:p>
+    <w:p>
+      <w:pPr>
+        <w:numPr>
+          <w:ilvl w:val="1"/>
+          <w:numId w:val="4"/>
+        </w:numPr>
+      </w:pPr>
+      <w:r>
+        <w:t>Measured redshift (z)</w:t>
+      </w:r>
+    </w:p>
+    <w:p>
+      <w:pPr>
+        <w:numPr>
+          <w:ilvl w:val="1"/>
+          <w:numId w:val="4"/>
+        </w:numPr>
+      </w:pPr>
+      <w:r>
+        <w:t>T90 duration</w:t>
+      </w:r>
+    </w:p>
+    <w:p>
+      <w:r>
+        <w:t>After cleaning and removal of ambiguous redshift entries:</w:t>
       </w:r>
     </w:p>
     <w:p>
       <w:pPr>
         <w:numPr>
           <w:ilvl w:val="0"/>
-          <w:numId w:val="1"/>
+          <w:numId w:val="5"/>
         </w:numPr>
       </w:pPr>
       <w:r>
-        <w:t>Examined both rolling windows and quantile bins</w:t>
-      </w:r>
-    </w:p>
-    <w:p>
-      <w:r>
-        <w:rPr>
-          <w:b/>
-          <w:bCs/>
-        </w:rPr>
-        <w:t>Result</w:t>
-      </w:r>
-      <w:r>
-        <w:t>:</w:t>
+        <w:t>Initial Swift sample: 1,760 GRBs</w:t>
       </w:r>
     </w:p>
     <w:p>
       <w:pPr>
         <w:numPr>
           <w:ilvl w:val="0"/>
-          <w:numId w:val="2"/>
+          <w:numId w:val="5"/>
         </w:numPr>
       </w:pPr>
       <w:r>
-        <w:t>Strong apparent decrease in jitter at higher redshift (lower variance in the early universe).</w:t>
+        <w:t>GRBs with usable redshift measurements: 504</w:t>
       </w:r>
     </w:p>
     <w:p>
       <w:pPr>
         <w:numPr>
           <w:ilvl w:val="0"/>
-          <w:numId w:val="2"/>
+          <w:numId w:val="5"/>
         </w:numPr>
       </w:pPr>
       <w:r>
-        <w:t>Sharp drop around z ≈ 1–2, then relatively flat at higher z.</w:t>
+        <w:t>Strict analysis sample: 475 GRBs</w:t>
+      </w:r>
+    </w:p>
+    <w:p>
+      <w:r>
+        <w:t>Redshift range:</w:t>
       </w:r>
     </w:p>
     <w:p>
       <w:pPr>
         <w:numPr>
           <w:ilvl w:val="0"/>
-          <w:numId w:val="2"/>
+          <w:numId w:val="6"/>
         </w:numPr>
       </w:pPr>
       <w:r>
-        <w:t>Negative correlation between redshift and scatter.</w:t>
-      </w:r>
-    </w:p>
-    <w:p>
-      <w:r>
-        <w:rPr>
-          <w:b/>
-          <w:bCs/>
-        </w:rPr>
-        <w:t>Interpretation</w:t>
-      </w:r>
-      <w:r>
-        <w:t xml:space="preserve">: The observed trend is </w:t>
-      </w:r>
-      <w:r>
-        <w:rPr>
-          <w:b/>
-          <w:bCs/>
-        </w:rPr>
-        <w:t>directionally consistent</w:t>
-      </w:r>
-      <w:r>
-        <w:t xml:space="preserve"> with the prediction (less jitter in the early universe). However, it is likely dominated by strong observational selection biases — at high redshift we primarily detect the brightest GRBs, which naturally compresses the observed distribution.</w:t>
-      </w:r>
-    </w:p>
-    <w:p>
-      <w:r>
-        <w:rPr>
-          <w:b/>
-          <w:bCs/>
-        </w:rPr>
-        <w:t>Conclusion</w:t>
-      </w:r>
-      <w:r>
-        <w:t xml:space="preserve">: This </w:t>
-      </w:r>
-      <w:proofErr w:type="gramStart"/>
-      <w:r>
-        <w:t>particular test</w:t>
-      </w:r>
-      <w:proofErr w:type="gramEnd"/>
-      <w:r>
-        <w:t xml:space="preserve"> is </w:t>
-      </w:r>
-      <w:r>
-        <w:rPr>
-          <w:b/>
-          <w:bCs/>
-        </w:rPr>
-        <w:t>inconclusive</w:t>
-      </w:r>
-      <w:r>
-        <w:t xml:space="preserve">. While the direction matches the qualitative expectation from Temporal Coherence Gravity, current data quality and selection effects prevent </w:t>
-      </w:r>
-      <w:proofErr w:type="gramStart"/>
-      <w:r>
-        <w:t>a robust</w:t>
-      </w:r>
-      <w:proofErr w:type="gramEnd"/>
-      <w:r>
-        <w:t xml:space="preserve"> confirmation or falsification.</w:t>
-      </w:r>
-    </w:p>
-    <w:p>
-      <w:r>
-        <w:rPr>
-          <w:b/>
-          <w:bCs/>
-        </w:rPr>
-        <w:t>Files</w:t>
-      </w:r>
-      <w:r>
-        <w:t>:</w:t>
+        <w:t>Minimum z ≈ 0.037</w:t>
       </w:r>
     </w:p>
     <w:p>
       <w:pPr>
         <w:numPr>
           <w:ilvl w:val="0"/>
-          <w:numId w:val="3"/>
+          <w:numId w:val="6"/>
         </w:numPr>
       </w:pPr>
       <w:r>
-        <w:t>causality_jitter_vs_redshift.png (main result plot)</w:t>
+        <w:lastRenderedPageBreak/>
+        <w:t>Maximum z ≈ 9.38</w:t>
+      </w:r>
+    </w:p>
+    <w:p>
+      <w:r>
+        <w:pict w14:anchorId="0E77A8F4">
+          <v:rect id="_x0000_i1152" style="width:0;height:1.5pt" o:hralign="center" o:hrstd="t" o:hr="t" fillcolor="#a0a0a0" stroked="f"/>
+        </w:pict>
+      </w:r>
+    </w:p>
+    <w:p>
+      <w:pPr>
+        <w:rPr>
+          <w:b/>
+          <w:bCs/>
+        </w:rPr>
+      </w:pPr>
+      <w:r>
+        <w:rPr>
+          <w:b/>
+          <w:bCs/>
+        </w:rPr>
+        <w:t>Methodology</w:t>
+      </w:r>
+    </w:p>
+    <w:p>
+      <w:pPr>
+        <w:rPr>
+          <w:b/>
+          <w:bCs/>
+        </w:rPr>
+      </w:pPr>
+      <w:r>
+        <w:rPr>
+          <w:b/>
+          <w:bCs/>
+        </w:rPr>
+        <w:t>Time-Dilation Correction</w:t>
+      </w:r>
+    </w:p>
+    <w:p>
+      <w:r>
+        <w:t>Observed durations were corrected for cosmological expansion using:</w:t>
+      </w:r>
+    </w:p>
+    <w:p>
+      <w:r>
+        <w:t>T90corr = T90 / (1 + z)</w:t>
+      </w:r>
+    </w:p>
+    <w:p>
+      <w:r>
+        <w:t>where:</w:t>
       </w:r>
     </w:p>
     <w:p>
       <w:pPr>
         <w:numPr>
           <w:ilvl w:val="0"/>
-          <w:numId w:val="3"/>
+          <w:numId w:val="7"/>
         </w:numPr>
       </w:pPr>
       <w:r>
-        <w:t>grb_final.csv (cleaned dataset)</w:t>
+        <w:t>T90 = observed duration containing 90% of burst fluence</w:t>
       </w:r>
     </w:p>
     <w:p>
       <w:pPr>
         <w:numPr>
           <w:ilvl w:val="0"/>
-          <w:numId w:val="3"/>
+          <w:numId w:val="7"/>
         </w:numPr>
       </w:pPr>
       <w:r>
-        <w:t>Analysis notebook/script available in repository</w:t>
-      </w:r>
-    </w:p>
-    <w:p>
-      <w:r>
-        <w:rPr>
-          <w:b/>
-          <w:bCs/>
-        </w:rPr>
-        <w:t>Status</w:t>
-      </w:r>
-      <w:r>
-        <w:t>: Negative / Weakly Supportive Result (selection-limited)</w:t>
+        <w:t>z = measured redshift</w:t>
+      </w:r>
+    </w:p>
+    <w:p>
+      <w:r>
+        <w:t xml:space="preserve">This removes the </w:t>
+      </w:r>
+      <w:proofErr w:type="gramStart"/>
+      <w:r>
+        <w:t>first-order</w:t>
+      </w:r>
+      <w:proofErr w:type="gramEnd"/>
+      <w:r>
+        <w:t xml:space="preserve"> stretching expected from cosmic expansion and approximates the intrinsic burst duration.</w:t>
+      </w:r>
+    </w:p>
+    <w:p>
+      <w:pPr>
+        <w:rPr>
+          <w:b/>
+          <w:bCs/>
+        </w:rPr>
+      </w:pPr>
+      <w:r>
+        <w:rPr>
+          <w:b/>
+          <w:bCs/>
+        </w:rPr>
+        <w:t>Statistical Analysis</w:t>
+      </w:r>
+    </w:p>
+    <w:p>
+      <w:r>
+        <w:t>The cleaned sample was divided into 12 equal-population redshift bins using quantile binning.</w:t>
+      </w:r>
+    </w:p>
+    <w:p>
+      <w:r>
+        <w:t>For each bin:</w:t>
+      </w:r>
+    </w:p>
+    <w:p>
+      <w:pPr>
+        <w:numPr>
+          <w:ilvl w:val="0"/>
+          <w:numId w:val="8"/>
+        </w:numPr>
+      </w:pPr>
+      <w:r>
+        <w:t>Mean redshift was calculated.</w:t>
+      </w:r>
+    </w:p>
+    <w:p>
+      <w:pPr>
+        <w:numPr>
+          <w:ilvl w:val="0"/>
+          <w:numId w:val="8"/>
+        </w:numPr>
+      </w:pPr>
+      <w:r>
+        <w:t>Standard deviation of corrected durations was calculated.</w:t>
+      </w:r>
+    </w:p>
+    <w:p>
+      <w:pPr>
+        <w:numPr>
+          <w:ilvl w:val="0"/>
+          <w:numId w:val="8"/>
+        </w:numPr>
+      </w:pPr>
+      <w:r>
+        <w:t>Variance of corrected durations was calculated.</w:t>
+      </w:r>
+    </w:p>
+    <w:p>
+      <w:pPr>
+        <w:numPr>
+          <w:ilvl w:val="0"/>
+          <w:numId w:val="8"/>
+        </w:numPr>
+      </w:pPr>
+      <w:r>
+        <w:t>Sample size was recorded.</w:t>
+      </w:r>
+    </w:p>
+    <w:p>
+      <w:r>
+        <w:t>Approximately 40–42 GRBs were present in each bin, minimizing small-number statistical effects.</w:t>
+      </w:r>
+    </w:p>
+    <w:p>
+      <w:r>
+        <w:pict w14:anchorId="1F99423A">
+          <v:rect id="_x0000_i1153" style="width:0;height:1.5pt" o:hralign="center" o:hrstd="t" o:hr="t" fillcolor="#a0a0a0" stroked="f"/>
+        </w:pict>
+      </w:r>
+    </w:p>
+    <w:p>
+      <w:pPr>
+        <w:rPr>
+          <w:b/>
+          <w:bCs/>
+        </w:rPr>
+      </w:pPr>
+      <w:r>
+        <w:rPr>
+          <w:b/>
+          <w:bCs/>
+        </w:rPr>
+        <w:t>Results</w:t>
+      </w:r>
+    </w:p>
+    <w:p>
+      <w:pPr>
+        <w:rPr>
+          <w:b/>
+          <w:bCs/>
+        </w:rPr>
+      </w:pPr>
+      <w:r>
+        <w:rPr>
+          <w:b/>
+          <w:bCs/>
+        </w:rPr>
+        <w:t>Corrected Duration Distribution</w:t>
+      </w:r>
+    </w:p>
+    <w:p>
+      <w:r>
+        <w:t>The corrected duration distribution remains broad across all redshifts, spanning approximately three orders of magnitude.</w:t>
+      </w:r>
+    </w:p>
+    <w:p>
+      <w:r>
+        <w:t>No obvious single-duration population emerges after cosmological correction.</w:t>
+      </w:r>
+    </w:p>
+    <w:p>
+      <w:pPr>
+        <w:rPr>
+          <w:b/>
+          <w:bCs/>
+        </w:rPr>
+      </w:pPr>
+      <w:r>
+        <w:rPr>
+          <w:b/>
+          <w:bCs/>
+        </w:rPr>
+        <w:lastRenderedPageBreak/>
+        <w:t>Jitter (Spread) vs Redshift</w:t>
+      </w:r>
+    </w:p>
+    <w:p>
+      <w:r>
+        <w:t>A systematic decline in duration scatter is observed with increasing redshift.</w:t>
+      </w:r>
+    </w:p>
+    <w:p>
+      <w:r>
+        <w:t>Key observations:</w:t>
+      </w:r>
+    </w:p>
+    <w:p>
+      <w:pPr>
+        <w:numPr>
+          <w:ilvl w:val="0"/>
+          <w:numId w:val="9"/>
+        </w:numPr>
+      </w:pPr>
+      <w:r>
+        <w:t>Lowest-redshift bins exhibit the largest duration spread.</w:t>
+      </w:r>
+    </w:p>
+    <w:p>
+      <w:pPr>
+        <w:numPr>
+          <w:ilvl w:val="0"/>
+          <w:numId w:val="9"/>
+        </w:numPr>
+      </w:pPr>
+      <w:r>
+        <w:t>Scatter decreases significantly between approximately z ≈ 0.3 and z ≈ 2.</w:t>
+      </w:r>
+    </w:p>
+    <w:p>
+      <w:pPr>
+        <w:numPr>
+          <w:ilvl w:val="0"/>
+          <w:numId w:val="9"/>
+        </w:numPr>
+      </w:pPr>
+      <w:r>
+        <w:t>Above z ≈ 2, duration variability remains substantially lower than nearby-universe values.</w:t>
+      </w:r>
+    </w:p>
+    <w:p>
+      <w:pPr>
+        <w:numPr>
+          <w:ilvl w:val="0"/>
+          <w:numId w:val="9"/>
+        </w:numPr>
+      </w:pPr>
+      <w:r>
+        <w:t>Variance and standard deviation show the same overall behavior.</w:t>
+      </w:r>
+    </w:p>
+    <w:p>
+      <w:pPr>
+        <w:rPr>
+          <w:b/>
+          <w:bCs/>
+        </w:rPr>
+      </w:pPr>
+      <w:r>
+        <w:rPr>
+          <w:b/>
+          <w:bCs/>
+        </w:rPr>
+        <w:t>Variance Trend</w:t>
+      </w:r>
+    </w:p>
+    <w:p>
+      <w:r>
+        <w:t>The variance of T90corr decreases by roughly one to two orders of magnitude from the lowest-redshift bins to the highest-redshift bins.</w:t>
+      </w:r>
+    </w:p>
+    <w:p>
+      <w:r>
+        <w:t>The trend is monotonic overall, although individual bins exhibit expected statistical fluctuations.</w:t>
+      </w:r>
+    </w:p>
+    <w:p>
+      <w:r>
+        <w:pict w14:anchorId="558E7DA4">
+          <v:rect id="_x0000_i1154" style="width:0;height:1.5pt" o:hralign="center" o:hrstd="t" o:hr="t" fillcolor="#a0a0a0" stroked="f"/>
+        </w:pict>
+      </w:r>
+    </w:p>
+    <w:p>
+      <w:pPr>
+        <w:rPr>
+          <w:b/>
+          <w:bCs/>
+        </w:rPr>
+      </w:pPr>
+      <w:r>
+        <w:rPr>
+          <w:b/>
+          <w:bCs/>
+        </w:rPr>
+        <w:t>Interpretation</w:t>
+      </w:r>
+    </w:p>
+    <w:p>
+      <w:r>
+        <w:t>The observed trend is directionally consistent with the qualitative prediction of the Temporal Coherence Gravity framework:</w:t>
+      </w:r>
+    </w:p>
+    <w:p>
+      <w:r>
+        <w:t>Earlier cosmic epochs appear to exhibit less scatter in corrected GRB durations than the modern universe.</w:t>
+      </w:r>
+    </w:p>
+    <w:p>
+      <w:r>
+        <w:t xml:space="preserve">If intrinsic duration variability can be interpreted as a proxy for temporal coherence fluctuations, then the data </w:t>
+      </w:r>
+      <w:proofErr w:type="gramStart"/>
+      <w:r>
+        <w:t>suggest</w:t>
+      </w:r>
+      <w:proofErr w:type="gramEnd"/>
+      <w:r>
+        <w:t xml:space="preserve"> a more coherent early universe.</w:t>
+      </w:r>
+    </w:p>
+    <w:p>
+      <w:r>
+        <w:t>However, several conventional explanations remain viable.</w:t>
+      </w:r>
+    </w:p>
+    <w:p>
+      <w:pPr>
+        <w:rPr>
+          <w:b/>
+          <w:bCs/>
+        </w:rPr>
+      </w:pPr>
+      <w:r>
+        <w:rPr>
+          <w:b/>
+          <w:bCs/>
+        </w:rPr>
+        <w:t>Major Caveats</w:t>
+      </w:r>
+    </w:p>
+    <w:p>
+      <w:pPr>
+        <w:rPr>
+          <w:b/>
+          <w:bCs/>
+        </w:rPr>
+      </w:pPr>
+      <w:r>
+        <w:rPr>
+          <w:b/>
+          <w:bCs/>
+        </w:rPr>
+        <w:t>Selection Effects</w:t>
+      </w:r>
+    </w:p>
+    <w:p>
+      <w:r>
+        <w:t>This is currently the dominant concern.</w:t>
+      </w:r>
+    </w:p>
+    <w:p>
+      <w:r>
+        <w:t>At high redshift, only the brightest and most easily detected GRBs are observable.</w:t>
+      </w:r>
+    </w:p>
+    <w:p>
+      <w:r>
+        <w:t>This naturally narrows the observed duration distribution and can produce an apparent reduction in variance independent of any underlying physical effect.</w:t>
+      </w:r>
+    </w:p>
+    <w:p>
+      <w:pPr>
+        <w:rPr>
+          <w:b/>
+          <w:bCs/>
+        </w:rPr>
+      </w:pPr>
+      <w:r>
+        <w:rPr>
+          <w:b/>
+          <w:bCs/>
+        </w:rPr>
+        <w:lastRenderedPageBreak/>
+        <w:t>Instrumental Bias</w:t>
+      </w:r>
+    </w:p>
+    <w:p>
+      <w:r>
+        <w:t>The Swift BAT detector has finite sensitivity and trigger thresholds.</w:t>
+      </w:r>
+    </w:p>
+    <w:p>
+      <w:r>
+        <w:t>Detection efficiency changes with redshift and burst luminosity, potentially altering the sampled population.</w:t>
+      </w:r>
+    </w:p>
+    <w:p>
+      <w:pPr>
+        <w:rPr>
+          <w:b/>
+          <w:bCs/>
+        </w:rPr>
+      </w:pPr>
+      <w:r>
+        <w:rPr>
+          <w:b/>
+          <w:bCs/>
+        </w:rPr>
+        <w:t>Population Evolution</w:t>
+      </w:r>
+    </w:p>
+    <w:p>
+      <w:r>
+        <w:t>Different progenitor populations may dominate at different cosmic epochs.</w:t>
+      </w:r>
+    </w:p>
+    <w:p>
+      <w:r>
+        <w:t>A changing GRB population could mimic a coherence-related signal.</w:t>
+      </w:r>
+    </w:p>
+    <w:p>
+      <w:pPr>
+        <w:rPr>
+          <w:b/>
+          <w:bCs/>
+        </w:rPr>
+      </w:pPr>
+      <w:r>
+        <w:rPr>
+          <w:b/>
+          <w:bCs/>
+        </w:rPr>
+        <w:t>Duration as a Proxy</w:t>
+      </w:r>
+    </w:p>
+    <w:p>
+      <w:r>
+        <w:t>T90 is an indirect measure and is influenced by:</w:t>
+      </w:r>
+    </w:p>
+    <w:p>
+      <w:pPr>
+        <w:numPr>
+          <w:ilvl w:val="0"/>
+          <w:numId w:val="10"/>
+        </w:numPr>
+      </w:pPr>
+      <w:r>
+        <w:t>Central engine activity</w:t>
+      </w:r>
+    </w:p>
+    <w:p>
+      <w:pPr>
+        <w:numPr>
+          <w:ilvl w:val="0"/>
+          <w:numId w:val="10"/>
+        </w:numPr>
+      </w:pPr>
+      <w:r>
+        <w:t>Jet structure</w:t>
+      </w:r>
+    </w:p>
+    <w:p>
+      <w:pPr>
+        <w:numPr>
+          <w:ilvl w:val="0"/>
+          <w:numId w:val="10"/>
+        </w:numPr>
+      </w:pPr>
+      <w:r>
+        <w:t>Detector sensitivity</w:t>
+      </w:r>
+    </w:p>
+    <w:p>
+      <w:pPr>
+        <w:numPr>
+          <w:ilvl w:val="0"/>
+          <w:numId w:val="10"/>
+        </w:numPr>
+      </w:pPr>
+      <w:r>
+        <w:t>Spectral evolution</w:t>
+      </w:r>
+    </w:p>
+    <w:p>
+      <w:proofErr w:type="gramStart"/>
+      <w:r>
+        <w:t>Therefore</w:t>
+      </w:r>
+      <w:proofErr w:type="gramEnd"/>
+      <w:r>
+        <w:t xml:space="preserve"> duration variance is only a preliminary proxy for coherence-related effects.</w:t>
+      </w:r>
+    </w:p>
+    <w:p>
+      <w:r>
+        <w:pict w14:anchorId="5676DCDC">
+          <v:rect id="_x0000_i1155" style="width:0;height:1.5pt" o:hralign="center" o:hrstd="t" o:hr="t" fillcolor="#a0a0a0" stroked="f"/>
+        </w:pict>
+      </w:r>
+    </w:p>
+    <w:p>
+      <w:pPr>
+        <w:rPr>
+          <w:b/>
+          <w:bCs/>
+        </w:rPr>
+      </w:pPr>
+      <w:r>
+        <w:rPr>
+          <w:b/>
+          <w:bCs/>
+        </w:rPr>
+        <w:t>Assessment</w:t>
+      </w:r>
+    </w:p>
+    <w:p>
+      <w:pPr>
+        <w:rPr>
+          <w:b/>
+          <w:bCs/>
+        </w:rPr>
+      </w:pPr>
+      <w:r>
+        <w:rPr>
+          <w:b/>
+          <w:bCs/>
+        </w:rPr>
+        <w:t>Does the result support the prediction?</w:t>
+      </w:r>
+    </w:p>
+    <w:p>
+      <w:r>
+        <w:t>Yes, directionally.</w:t>
+      </w:r>
+    </w:p>
+    <w:p>
+      <w:r>
+        <w:t>The observed trend matches the qualitative expectation:</w:t>
+      </w:r>
+    </w:p>
+    <w:p>
+      <w:r>
+        <w:t xml:space="preserve">Higher </w:t>
+      </w:r>
+      <w:proofErr w:type="gramStart"/>
+      <w:r>
+        <w:t>redshift → lower duration</w:t>
+      </w:r>
+      <w:proofErr w:type="gramEnd"/>
+      <w:r>
+        <w:t xml:space="preserve"> scatter.</w:t>
+      </w:r>
+    </w:p>
+    <w:p>
+      <w:pPr>
+        <w:rPr>
+          <w:b/>
+          <w:bCs/>
+        </w:rPr>
+      </w:pPr>
+      <w:r>
+        <w:rPr>
+          <w:b/>
+          <w:bCs/>
+        </w:rPr>
+        <w:t>Does the result confirm the hypothesis?</w:t>
+      </w:r>
+    </w:p>
+    <w:p>
+      <w:r>
+        <w:t>No.</w:t>
+      </w:r>
+    </w:p>
+    <w:p>
+      <w:r>
+        <w:t xml:space="preserve">Current observational selection effects are sufficiently strong </w:t>
+      </w:r>
+      <w:proofErr w:type="gramStart"/>
+      <w:r>
+        <w:t>that</w:t>
+      </w:r>
+      <w:proofErr w:type="gramEnd"/>
+      <w:r>
+        <w:t xml:space="preserve"> the observed trend cannot yet be uniquely attributed to temporal coherence.</w:t>
+      </w:r>
+    </w:p>
+    <w:p>
+      <w:pPr>
+        <w:rPr>
+          <w:b/>
+          <w:bCs/>
+        </w:rPr>
+      </w:pPr>
+      <w:r>
+        <w:rPr>
+          <w:b/>
+          <w:bCs/>
+        </w:rPr>
+        <w:t>Does the result falsify the hypothesis?</w:t>
+      </w:r>
+    </w:p>
+    <w:p>
+      <w:r>
+        <w:t>No.</w:t>
+      </w:r>
+    </w:p>
+    <w:p>
+      <w:r>
+        <w:lastRenderedPageBreak/>
+        <w:t>The sign of the effect is consistent with the prediction and therefore does not contradict the model.</w:t>
+      </w:r>
+    </w:p>
+    <w:p>
+      <w:r>
+        <w:pict w14:anchorId="2903CD6C">
+          <v:rect id="_x0000_i1156" style="width:0;height:1.5pt" o:hralign="center" o:hrstd="t" o:hr="t" fillcolor="#a0a0a0" stroked="f"/>
+        </w:pict>
+      </w:r>
+    </w:p>
+    <w:p>
+      <w:pPr>
+        <w:rPr>
+          <w:b/>
+          <w:bCs/>
+        </w:rPr>
+      </w:pPr>
+      <w:r>
+        <w:rPr>
+          <w:b/>
+          <w:bCs/>
+        </w:rPr>
+        <w:t>Recommended Follow-Up Work</w:t>
+      </w:r>
+    </w:p>
+    <w:p>
+      <w:pPr>
+        <w:numPr>
+          <w:ilvl w:val="0"/>
+          <w:numId w:val="11"/>
+        </w:numPr>
+      </w:pPr>
+      <w:r>
+        <w:t>Repeat analysis using logarithmic duration statistics.</w:t>
+      </w:r>
+    </w:p>
+    <w:p>
+      <w:pPr>
+        <w:numPr>
+          <w:ilvl w:val="0"/>
+          <w:numId w:val="11"/>
+        </w:numPr>
+      </w:pPr>
+      <w:r>
+        <w:t>Use robust estimators such as Median Absolute Deviation (MAD).</w:t>
+      </w:r>
+    </w:p>
+    <w:p>
+      <w:pPr>
+        <w:numPr>
+          <w:ilvl w:val="0"/>
+          <w:numId w:val="11"/>
+        </w:numPr>
+      </w:pPr>
+      <w:r>
+        <w:t>Remove extreme-duration outliers and re-test.</w:t>
+      </w:r>
+    </w:p>
+    <w:p>
+      <w:pPr>
+        <w:numPr>
+          <w:ilvl w:val="0"/>
+          <w:numId w:val="11"/>
+        </w:numPr>
+      </w:pPr>
+      <w:r>
+        <w:t>Separate short and long GRB populations.</w:t>
+      </w:r>
+    </w:p>
+    <w:p>
+      <w:pPr>
+        <w:numPr>
+          <w:ilvl w:val="0"/>
+          <w:numId w:val="11"/>
+        </w:numPr>
+      </w:pPr>
+      <w:proofErr w:type="gramStart"/>
+      <w:r>
+        <w:t>Compare against</w:t>
+      </w:r>
+      <w:proofErr w:type="gramEnd"/>
+      <w:r>
+        <w:t xml:space="preserve"> synthetic populations with known selection effects.</w:t>
+      </w:r>
+    </w:p>
+    <w:p>
+      <w:pPr>
+        <w:numPr>
+          <w:ilvl w:val="0"/>
+          <w:numId w:val="11"/>
+        </w:numPr>
+      </w:pPr>
+      <w:r>
+        <w:t>Investigate spectral lag variance as a potentially cleaner coherence indicator.</w:t>
+      </w:r>
+    </w:p>
+    <w:p>
+      <w:pPr>
+        <w:numPr>
+          <w:ilvl w:val="0"/>
+          <w:numId w:val="11"/>
+        </w:numPr>
+      </w:pPr>
+      <w:proofErr w:type="gramStart"/>
+      <w:r>
+        <w:t>Extend</w:t>
+      </w:r>
+      <w:proofErr w:type="gramEnd"/>
+      <w:r>
+        <w:t xml:space="preserve"> analysis to additional GRB catalogs beyond Swift BAT.</w:t>
+      </w:r>
+    </w:p>
+    <w:p>
+      <w:r>
+        <w:pict w14:anchorId="11EC787C">
+          <v:rect id="_x0000_i1157" style="width:0;height:1.5pt" o:hralign="center" o:hrstd="t" o:hr="t" fillcolor="#a0a0a0" stroked="f"/>
+        </w:pict>
+      </w:r>
+    </w:p>
+    <w:p>
+      <w:pPr>
+        <w:rPr>
+          <w:b/>
+          <w:bCs/>
+        </w:rPr>
+      </w:pPr>
+      <w:r>
+        <w:rPr>
+          <w:b/>
+          <w:bCs/>
+        </w:rPr>
+        <w:t>Conclusion</w:t>
+      </w:r>
+    </w:p>
+    <w:p>
+      <w:r>
+        <w:t>A cleaned sample of 475 GRBs with measured redshifts exhibits a clear decrease in corrected-duration variance with increasing redshift.</w:t>
+      </w:r>
+    </w:p>
+    <w:p>
+      <w:r>
+        <w:t>The sign of the effect is consistent with the Temporal Coherence Gravity expectation of a more coherent early universe. However, substantial observational selection effects remain a plausible conventional explanation.</w:t>
+      </w:r>
+    </w:p>
+    <w:p>
+      <w:r>
+        <w:t>At present, the result should be considered:</w:t>
+      </w:r>
+    </w:p>
+    <w:p>
+      <w:r>
+        <w:rPr>
+          <w:b/>
+          <w:bCs/>
+        </w:rPr>
+        <w:t>Weakly Supportive but Inconclusive</w:t>
+      </w:r>
+    </w:p>
+    <w:p>
+      <w:r>
+        <w:t>The analysis motivates additional testing using more robust timing observables and stronger controls for observational bias.</w:t>
       </w:r>
     </w:p>
     <w:p/>
@@ -281,6 +1053,268 @@
 <file path=word/numbering.xml><?xml version="1.0" encoding="utf-8"?>
 <w:numbering xmlns:wpc="http://schemas.microsoft.com/office/word/2010/wordprocessingCanvas" xmlns:cx="http://schemas.microsoft.com/office/drawing/2014/chartex" xmlns:cx1="http://schemas.microsoft.com/office/drawing/2015/9/8/chartex" xmlns:cx2="http://schemas.microsoft.com/office/drawing/2015/10/21/chartex" xmlns:cx3="http://schemas.microsoft.com/office/drawing/2016/5/9/chartex" xmlns:cx4="http://schemas.microsoft.com/office/drawing/2016/5/10/chartex" xmlns:cx5="http://schemas.microsoft.com/office/drawing/2016/5/11/chartex" xmlns:cx6="http://schemas.microsoft.com/office/drawing/2016/5/12/chartex" xmlns:cx7="http://schemas.microsoft.com/office/drawing/2016/5/13/chartex" xmlns:cx8="http://schemas.microsoft.com/office/drawing/2016/5/14/chartex" xmlns:mc="http://schemas.openxmlformats.org/markup-compatibility/2006" xmlns:aink="http://schemas.microsoft.com/office/drawing/2016/ink" xmlns:am3d="http://schemas.microsoft.com/office/drawing/2017/model3d" xmlns:o="urn:schemas-microsoft-com:office:office" xmlns:oel="http://schemas.microsoft.com/office/2019/extlst" xmlns:r="http://schemas.openxmlformats.org/officeDocument/2006/relationships" xmlns:m="http://schemas.openxmlformats.org/officeDocument/2006/math" xmlns:v="urn:schemas-microsoft-com:vml" xmlns:wp14="http://schemas.microsoft.com/office/word/2010/wordprocessingDrawing" xmlns:wp="http://schemas.openxmlformats.org/drawingml/2006/wordprocessingDrawing" xmlns:w10="urn:schemas-microsoft-com:office:word" xmlns:w="http://schemas.openxmlformats.org/wordprocessingml/2006/main" xmlns:w14="http://schemas.microsoft.com/office/word/2010/wordml" xmlns:w15="http://schemas.microsoft.com/office/word/2012/wordml" xmlns:w16cex="http://schemas.microsoft.com/office/word/2018/wordml/cex" xmlns:w16cid="http://schemas.microsoft.com/office/word/2016/wordml/cid" xmlns:w16="http://schemas.microsoft.com/office/word/2018/wordml" xmlns:w16du="http://schemas.microsoft.com/office/word/2023/wordml/word16du" xmlns:w16sdtdh="http://schemas.microsoft.com/office/word/2020/wordml/sdtdatahash" xmlns:w16sdtfl="http://schemas.microsoft.com/office/word/2024/wordml/sdtformatlock" xmlns:w16se="http://schemas.microsoft.com/office/word/2015/wordml/symex" xmlns:wpg="http://schemas.microsoft.com/office/word/2010/wordprocessingGroup" xmlns:wpi="http://schemas.microsoft.com/office/word/2010/wordprocessingInk" xmlns:wne="http://schemas.microsoft.com/office/word/2006/wordml" xmlns:wps="http://schemas.microsoft.com/office/word/2010/wordprocessingShape" mc:Ignorable="w14 w15 w16se w16cid w16 w16cex w16sdtdh w16sdtfl w16du wp14">
   <w:abstractNum w:abstractNumId="0" w15:restartNumberingAfterBreak="0">
+    <w:nsid w:val="00625AC1"/>
+    <w:multiLevelType w:val="multilevel"/>
+    <w:tmpl w:val="DB48FE6C"/>
+    <w:lvl w:ilvl="0">
+      <w:start w:val="1"/>
+      <w:numFmt w:val="bullet"/>
+      <w:lvlText w:val=""/>
+      <w:lvlJc w:val="left"/>
+      <w:pPr>
+        <w:tabs>
+          <w:tab w:val="num" w:pos="720"/>
+        </w:tabs>
+        <w:ind w:left="720" w:hanging="360"/>
+      </w:pPr>
+      <w:rPr>
+        <w:rFonts w:ascii="Symbol" w:hAnsi="Symbol" w:hint="default"/>
+        <w:sz w:val="20"/>
+      </w:rPr>
+    </w:lvl>
+    <w:lvl w:ilvl="1" w:tentative="1">
+      <w:start w:val="1"/>
+      <w:numFmt w:val="bullet"/>
+      <w:lvlText w:val="o"/>
+      <w:lvlJc w:val="left"/>
+      <w:pPr>
+        <w:tabs>
+          <w:tab w:val="num" w:pos="1440"/>
+        </w:tabs>
+        <w:ind w:left="1440" w:hanging="360"/>
+      </w:pPr>
+      <w:rPr>
+        <w:rFonts w:ascii="Courier New" w:hAnsi="Courier New" w:hint="default"/>
+        <w:sz w:val="20"/>
+      </w:rPr>
+    </w:lvl>
+    <w:lvl w:ilvl="2" w:tentative="1">
+      <w:start w:val="1"/>
+      <w:numFmt w:val="bullet"/>
+      <w:lvlText w:val=""/>
+      <w:lvlJc w:val="left"/>
+      <w:pPr>
+        <w:tabs>
+          <w:tab w:val="num" w:pos="2160"/>
+        </w:tabs>
+        <w:ind w:left="2160" w:hanging="360"/>
+      </w:pPr>
+      <w:rPr>
+        <w:rFonts w:ascii="Wingdings" w:hAnsi="Wingdings" w:hint="default"/>
+        <w:sz w:val="20"/>
+      </w:rPr>
+    </w:lvl>
+    <w:lvl w:ilvl="3" w:tentative="1">
+      <w:start w:val="1"/>
+      <w:numFmt w:val="bullet"/>
+      <w:lvlText w:val=""/>
+      <w:lvlJc w:val="left"/>
+      <w:pPr>
+        <w:tabs>
+          <w:tab w:val="num" w:pos="2880"/>
+        </w:tabs>
+        <w:ind w:left="2880" w:hanging="360"/>
+      </w:pPr>
+      <w:rPr>
+        <w:rFonts w:ascii="Wingdings" w:hAnsi="Wingdings" w:hint="default"/>
+        <w:sz w:val="20"/>
+      </w:rPr>
+    </w:lvl>
+    <w:lvl w:ilvl="4" w:tentative="1">
+      <w:start w:val="1"/>
+      <w:numFmt w:val="bullet"/>
+      <w:lvlText w:val=""/>
+      <w:lvlJc w:val="left"/>
+      <w:pPr>
+        <w:tabs>
+          <w:tab w:val="num" w:pos="3600"/>
+        </w:tabs>
+        <w:ind w:left="3600" w:hanging="360"/>
+      </w:pPr>
+      <w:rPr>
+        <w:rFonts w:ascii="Wingdings" w:hAnsi="Wingdings" w:hint="default"/>
+        <w:sz w:val="20"/>
+      </w:rPr>
+    </w:lvl>
+    <w:lvl w:ilvl="5" w:tentative="1">
+      <w:start w:val="1"/>
+      <w:numFmt w:val="bullet"/>
+      <w:lvlText w:val=""/>
+      <w:lvlJc w:val="left"/>
+      <w:pPr>
+        <w:tabs>
+          <w:tab w:val="num" w:pos="4320"/>
+        </w:tabs>
+        <w:ind w:left="4320" w:hanging="360"/>
+      </w:pPr>
+      <w:rPr>
+        <w:rFonts w:ascii="Wingdings" w:hAnsi="Wingdings" w:hint="default"/>
+        <w:sz w:val="20"/>
+      </w:rPr>
+    </w:lvl>
+    <w:lvl w:ilvl="6" w:tentative="1">
+      <w:start w:val="1"/>
+      <w:numFmt w:val="bullet"/>
+      <w:lvlText w:val=""/>
+      <w:lvlJc w:val="left"/>
+      <w:pPr>
+        <w:tabs>
+          <w:tab w:val="num" w:pos="5040"/>
+        </w:tabs>
+        <w:ind w:left="5040" w:hanging="360"/>
+      </w:pPr>
+      <w:rPr>
+        <w:rFonts w:ascii="Wingdings" w:hAnsi="Wingdings" w:hint="default"/>
+        <w:sz w:val="20"/>
+      </w:rPr>
+    </w:lvl>
+    <w:lvl w:ilvl="7" w:tentative="1">
+      <w:start w:val="1"/>
+      <w:numFmt w:val="bullet"/>
+      <w:lvlText w:val=""/>
+      <w:lvlJc w:val="left"/>
+      <w:pPr>
+        <w:tabs>
+          <w:tab w:val="num" w:pos="5760"/>
+        </w:tabs>
+        <w:ind w:left="5760" w:hanging="360"/>
+      </w:pPr>
+      <w:rPr>
+        <w:rFonts w:ascii="Wingdings" w:hAnsi="Wingdings" w:hint="default"/>
+        <w:sz w:val="20"/>
+      </w:rPr>
+    </w:lvl>
+    <w:lvl w:ilvl="8" w:tentative="1">
+      <w:start w:val="1"/>
+      <w:numFmt w:val="bullet"/>
+      <w:lvlText w:val=""/>
+      <w:lvlJc w:val="left"/>
+      <w:pPr>
+        <w:tabs>
+          <w:tab w:val="num" w:pos="6480"/>
+        </w:tabs>
+        <w:ind w:left="6480" w:hanging="360"/>
+      </w:pPr>
+      <w:rPr>
+        <w:rFonts w:ascii="Wingdings" w:hAnsi="Wingdings" w:hint="default"/>
+        <w:sz w:val="20"/>
+      </w:rPr>
+    </w:lvl>
+  </w:abstractNum>
+  <w:abstractNum w:abstractNumId="1" w15:restartNumberingAfterBreak="0">
+    <w:nsid w:val="0F81061F"/>
+    <w:multiLevelType w:val="multilevel"/>
+    <w:tmpl w:val="19C4CE1A"/>
+    <w:lvl w:ilvl="0">
+      <w:start w:val="1"/>
+      <w:numFmt w:val="decimal"/>
+      <w:lvlText w:val="%1."/>
+      <w:lvlJc w:val="left"/>
+      <w:pPr>
+        <w:tabs>
+          <w:tab w:val="num" w:pos="720"/>
+        </w:tabs>
+        <w:ind w:left="720" w:hanging="360"/>
+      </w:pPr>
+    </w:lvl>
+    <w:lvl w:ilvl="1" w:tentative="1">
+      <w:start w:val="1"/>
+      <w:numFmt w:val="decimal"/>
+      <w:lvlText w:val="%2."/>
+      <w:lvlJc w:val="left"/>
+      <w:pPr>
+        <w:tabs>
+          <w:tab w:val="num" w:pos="1440"/>
+        </w:tabs>
+        <w:ind w:left="1440" w:hanging="360"/>
+      </w:pPr>
+    </w:lvl>
+    <w:lvl w:ilvl="2" w:tentative="1">
+      <w:start w:val="1"/>
+      <w:numFmt w:val="decimal"/>
+      <w:lvlText w:val="%3."/>
+      <w:lvlJc w:val="left"/>
+      <w:pPr>
+        <w:tabs>
+          <w:tab w:val="num" w:pos="2160"/>
+        </w:tabs>
+        <w:ind w:left="2160" w:hanging="360"/>
+      </w:pPr>
+    </w:lvl>
+    <w:lvl w:ilvl="3" w:tentative="1">
+      <w:start w:val="1"/>
+      <w:numFmt w:val="decimal"/>
+      <w:lvlText w:val="%4."/>
+      <w:lvlJc w:val="left"/>
+      <w:pPr>
+        <w:tabs>
+          <w:tab w:val="num" w:pos="2880"/>
+        </w:tabs>
+        <w:ind w:left="2880" w:hanging="360"/>
+      </w:pPr>
+    </w:lvl>
+    <w:lvl w:ilvl="4" w:tentative="1">
+      <w:start w:val="1"/>
+      <w:numFmt w:val="decimal"/>
+      <w:lvlText w:val="%5."/>
+      <w:lvlJc w:val="left"/>
+      <w:pPr>
+        <w:tabs>
+          <w:tab w:val="num" w:pos="3600"/>
+        </w:tabs>
+        <w:ind w:left="3600" w:hanging="360"/>
+      </w:pPr>
+    </w:lvl>
+    <w:lvl w:ilvl="5" w:tentative="1">
+      <w:start w:val="1"/>
+      <w:numFmt w:val="decimal"/>
+      <w:lvlText w:val="%6."/>
+      <w:lvlJc w:val="left"/>
+      <w:pPr>
+        <w:tabs>
+          <w:tab w:val="num" w:pos="4320"/>
+        </w:tabs>
+        <w:ind w:left="4320" w:hanging="360"/>
+      </w:pPr>
+    </w:lvl>
+    <w:lvl w:ilvl="6" w:tentative="1">
+      <w:start w:val="1"/>
+      <w:numFmt w:val="decimal"/>
+      <w:lvlText w:val="%7."/>
+      <w:lvlJc w:val="left"/>
+      <w:pPr>
+        <w:tabs>
+          <w:tab w:val="num" w:pos="5040"/>
+        </w:tabs>
+        <w:ind w:left="5040" w:hanging="360"/>
+      </w:pPr>
+    </w:lvl>
+    <w:lvl w:ilvl="7" w:tentative="1">
+      <w:start w:val="1"/>
+      <w:numFmt w:val="decimal"/>
+      <w:lvlText w:val="%8."/>
+      <w:lvlJc w:val="left"/>
+      <w:pPr>
+        <w:tabs>
+          <w:tab w:val="num" w:pos="5760"/>
+        </w:tabs>
+        <w:ind w:left="5760" w:hanging="360"/>
+      </w:pPr>
+    </w:lvl>
+    <w:lvl w:ilvl="8" w:tentative="1">
+      <w:start w:val="1"/>
+      <w:numFmt w:val="decimal"/>
+      <w:lvlText w:val="%9."/>
+      <w:lvlJc w:val="left"/>
+      <w:pPr>
+        <w:tabs>
+          <w:tab w:val="num" w:pos="6480"/>
+        </w:tabs>
+        <w:ind w:left="6480" w:hanging="360"/>
+      </w:pPr>
+    </w:lvl>
+  </w:abstractNum>
+  <w:abstractNum w:abstractNumId="2" w15:restartNumberingAfterBreak="0">
     <w:nsid w:val="16137F0D"/>
     <w:multiLevelType w:val="multilevel"/>
     <w:tmpl w:val="FA0EA148"/>
@@ -429,7 +1463,156 @@
       </w:rPr>
     </w:lvl>
   </w:abstractNum>
-  <w:abstractNum w:abstractNumId="1" w15:restartNumberingAfterBreak="0">
+  <w:abstractNum w:abstractNumId="3" w15:restartNumberingAfterBreak="0">
+    <w:nsid w:val="187626AC"/>
+    <w:multiLevelType w:val="multilevel"/>
+    <w:tmpl w:val="9DECD14E"/>
+    <w:lvl w:ilvl="0">
+      <w:start w:val="1"/>
+      <w:numFmt w:val="bullet"/>
+      <w:lvlText w:val=""/>
+      <w:lvlJc w:val="left"/>
+      <w:pPr>
+        <w:tabs>
+          <w:tab w:val="num" w:pos="720"/>
+        </w:tabs>
+        <w:ind w:left="720" w:hanging="360"/>
+      </w:pPr>
+      <w:rPr>
+        <w:rFonts w:ascii="Symbol" w:hAnsi="Symbol" w:hint="default"/>
+        <w:sz w:val="20"/>
+      </w:rPr>
+    </w:lvl>
+    <w:lvl w:ilvl="1" w:tentative="1">
+      <w:start w:val="1"/>
+      <w:numFmt w:val="bullet"/>
+      <w:lvlText w:val="o"/>
+      <w:lvlJc w:val="left"/>
+      <w:pPr>
+        <w:tabs>
+          <w:tab w:val="num" w:pos="1440"/>
+        </w:tabs>
+        <w:ind w:left="1440" w:hanging="360"/>
+      </w:pPr>
+      <w:rPr>
+        <w:rFonts w:ascii="Courier New" w:hAnsi="Courier New" w:hint="default"/>
+        <w:sz w:val="20"/>
+      </w:rPr>
+    </w:lvl>
+    <w:lvl w:ilvl="2" w:tentative="1">
+      <w:start w:val="1"/>
+      <w:numFmt w:val="bullet"/>
+      <w:lvlText w:val=""/>
+      <w:lvlJc w:val="left"/>
+      <w:pPr>
+        <w:tabs>
+          <w:tab w:val="num" w:pos="2160"/>
+        </w:tabs>
+        <w:ind w:left="2160" w:hanging="360"/>
+      </w:pPr>
+      <w:rPr>
+        <w:rFonts w:ascii="Wingdings" w:hAnsi="Wingdings" w:hint="default"/>
+        <w:sz w:val="20"/>
+      </w:rPr>
+    </w:lvl>
+    <w:lvl w:ilvl="3" w:tentative="1">
+      <w:start w:val="1"/>
+      <w:numFmt w:val="bullet"/>
+      <w:lvlText w:val=""/>
+      <w:lvlJc w:val="left"/>
+      <w:pPr>
+        <w:tabs>
+          <w:tab w:val="num" w:pos="2880"/>
+        </w:tabs>
+        <w:ind w:left="2880" w:hanging="360"/>
+      </w:pPr>
+      <w:rPr>
+        <w:rFonts w:ascii="Wingdings" w:hAnsi="Wingdings" w:hint="default"/>
+        <w:sz w:val="20"/>
+      </w:rPr>
+    </w:lvl>
+    <w:lvl w:ilvl="4" w:tentative="1">
+      <w:start w:val="1"/>
+      <w:numFmt w:val="bullet"/>
+      <w:lvlText w:val=""/>
+      <w:lvlJc w:val="left"/>
+      <w:pPr>
+        <w:tabs>
+          <w:tab w:val="num" w:pos="3600"/>
+        </w:tabs>
+        <w:ind w:left="3600" w:hanging="360"/>
+      </w:pPr>
+      <w:rPr>
+        <w:rFonts w:ascii="Wingdings" w:hAnsi="Wingdings" w:hint="default"/>
+        <w:sz w:val="20"/>
+      </w:rPr>
+    </w:lvl>
+    <w:lvl w:ilvl="5" w:tentative="1">
+      <w:start w:val="1"/>
+      <w:numFmt w:val="bullet"/>
+      <w:lvlText w:val=""/>
+      <w:lvlJc w:val="left"/>
+      <w:pPr>
+        <w:tabs>
+          <w:tab w:val="num" w:pos="4320"/>
+        </w:tabs>
+        <w:ind w:left="4320" w:hanging="360"/>
+      </w:pPr>
+      <w:rPr>
+        <w:rFonts w:ascii="Wingdings" w:hAnsi="Wingdings" w:hint="default"/>
+        <w:sz w:val="20"/>
+      </w:rPr>
+    </w:lvl>
+    <w:lvl w:ilvl="6" w:tentative="1">
+      <w:start w:val="1"/>
+      <w:numFmt w:val="bullet"/>
+      <w:lvlText w:val=""/>
+      <w:lvlJc w:val="left"/>
+      <w:pPr>
+        <w:tabs>
+          <w:tab w:val="num" w:pos="5040"/>
+        </w:tabs>
+        <w:ind w:left="5040" w:hanging="360"/>
+      </w:pPr>
+      <w:rPr>
+        <w:rFonts w:ascii="Wingdings" w:hAnsi="Wingdings" w:hint="default"/>
+        <w:sz w:val="20"/>
+      </w:rPr>
+    </w:lvl>
+    <w:lvl w:ilvl="7" w:tentative="1">
+      <w:start w:val="1"/>
+      <w:numFmt w:val="bullet"/>
+      <w:lvlText w:val=""/>
+      <w:lvlJc w:val="left"/>
+      <w:pPr>
+        <w:tabs>
+          <w:tab w:val="num" w:pos="5760"/>
+        </w:tabs>
+        <w:ind w:left="5760" w:hanging="360"/>
+      </w:pPr>
+      <w:rPr>
+        <w:rFonts w:ascii="Wingdings" w:hAnsi="Wingdings" w:hint="default"/>
+        <w:sz w:val="20"/>
+      </w:rPr>
+    </w:lvl>
+    <w:lvl w:ilvl="8" w:tentative="1">
+      <w:start w:val="1"/>
+      <w:numFmt w:val="bullet"/>
+      <w:lvlText w:val=""/>
+      <w:lvlJc w:val="left"/>
+      <w:pPr>
+        <w:tabs>
+          <w:tab w:val="num" w:pos="6480"/>
+        </w:tabs>
+        <w:ind w:left="6480" w:hanging="360"/>
+      </w:pPr>
+      <w:rPr>
+        <w:rFonts w:ascii="Wingdings" w:hAnsi="Wingdings" w:hint="default"/>
+        <w:sz w:val="20"/>
+      </w:rPr>
+    </w:lvl>
+  </w:abstractNum>
+  <w:abstractNum w:abstractNumId="4" w15:restartNumberingAfterBreak="0">
     <w:nsid w:val="26A24E0B"/>
     <w:multiLevelType w:val="multilevel"/>
     <w:tmpl w:val="91EA511E"/>
@@ -578,7 +1761,305 @@
       </w:rPr>
     </w:lvl>
   </w:abstractNum>
-  <w:abstractNum w:abstractNumId="2" w15:restartNumberingAfterBreak="0">
+  <w:abstractNum w:abstractNumId="5" w15:restartNumberingAfterBreak="0">
+    <w:nsid w:val="2F272C9D"/>
+    <w:multiLevelType w:val="multilevel"/>
+    <w:tmpl w:val="5E24F43E"/>
+    <w:lvl w:ilvl="0">
+      <w:start w:val="1"/>
+      <w:numFmt w:val="bullet"/>
+      <w:lvlText w:val=""/>
+      <w:lvlJc w:val="left"/>
+      <w:pPr>
+        <w:tabs>
+          <w:tab w:val="num" w:pos="720"/>
+        </w:tabs>
+        <w:ind w:left="720" w:hanging="360"/>
+      </w:pPr>
+      <w:rPr>
+        <w:rFonts w:ascii="Symbol" w:hAnsi="Symbol" w:hint="default"/>
+        <w:sz w:val="20"/>
+      </w:rPr>
+    </w:lvl>
+    <w:lvl w:ilvl="1" w:tentative="1">
+      <w:start w:val="1"/>
+      <w:numFmt w:val="bullet"/>
+      <w:lvlText w:val="o"/>
+      <w:lvlJc w:val="left"/>
+      <w:pPr>
+        <w:tabs>
+          <w:tab w:val="num" w:pos="1440"/>
+        </w:tabs>
+        <w:ind w:left="1440" w:hanging="360"/>
+      </w:pPr>
+      <w:rPr>
+        <w:rFonts w:ascii="Courier New" w:hAnsi="Courier New" w:hint="default"/>
+        <w:sz w:val="20"/>
+      </w:rPr>
+    </w:lvl>
+    <w:lvl w:ilvl="2" w:tentative="1">
+      <w:start w:val="1"/>
+      <w:numFmt w:val="bullet"/>
+      <w:lvlText w:val=""/>
+      <w:lvlJc w:val="left"/>
+      <w:pPr>
+        <w:tabs>
+          <w:tab w:val="num" w:pos="2160"/>
+        </w:tabs>
+        <w:ind w:left="2160" w:hanging="360"/>
+      </w:pPr>
+      <w:rPr>
+        <w:rFonts w:ascii="Wingdings" w:hAnsi="Wingdings" w:hint="default"/>
+        <w:sz w:val="20"/>
+      </w:rPr>
+    </w:lvl>
+    <w:lvl w:ilvl="3" w:tentative="1">
+      <w:start w:val="1"/>
+      <w:numFmt w:val="bullet"/>
+      <w:lvlText w:val=""/>
+      <w:lvlJc w:val="left"/>
+      <w:pPr>
+        <w:tabs>
+          <w:tab w:val="num" w:pos="2880"/>
+        </w:tabs>
+        <w:ind w:left="2880" w:hanging="360"/>
+      </w:pPr>
+      <w:rPr>
+        <w:rFonts w:ascii="Wingdings" w:hAnsi="Wingdings" w:hint="default"/>
+        <w:sz w:val="20"/>
+      </w:rPr>
+    </w:lvl>
+    <w:lvl w:ilvl="4" w:tentative="1">
+      <w:start w:val="1"/>
+      <w:numFmt w:val="bullet"/>
+      <w:lvlText w:val=""/>
+      <w:lvlJc w:val="left"/>
+      <w:pPr>
+        <w:tabs>
+          <w:tab w:val="num" w:pos="3600"/>
+        </w:tabs>
+        <w:ind w:left="3600" w:hanging="360"/>
+      </w:pPr>
+      <w:rPr>
+        <w:rFonts w:ascii="Wingdings" w:hAnsi="Wingdings" w:hint="default"/>
+        <w:sz w:val="20"/>
+      </w:rPr>
+    </w:lvl>
+    <w:lvl w:ilvl="5" w:tentative="1">
+      <w:start w:val="1"/>
+      <w:numFmt w:val="bullet"/>
+      <w:lvlText w:val=""/>
+      <w:lvlJc w:val="left"/>
+      <w:pPr>
+        <w:tabs>
+          <w:tab w:val="num" w:pos="4320"/>
+        </w:tabs>
+        <w:ind w:left="4320" w:hanging="360"/>
+      </w:pPr>
+      <w:rPr>
+        <w:rFonts w:ascii="Wingdings" w:hAnsi="Wingdings" w:hint="default"/>
+        <w:sz w:val="20"/>
+      </w:rPr>
+    </w:lvl>
+    <w:lvl w:ilvl="6" w:tentative="1">
+      <w:start w:val="1"/>
+      <w:numFmt w:val="bullet"/>
+      <w:lvlText w:val=""/>
+      <w:lvlJc w:val="left"/>
+      <w:pPr>
+        <w:tabs>
+          <w:tab w:val="num" w:pos="5040"/>
+        </w:tabs>
+        <w:ind w:left="5040" w:hanging="360"/>
+      </w:pPr>
+      <w:rPr>
+        <w:rFonts w:ascii="Wingdings" w:hAnsi="Wingdings" w:hint="default"/>
+        <w:sz w:val="20"/>
+      </w:rPr>
+    </w:lvl>
+    <w:lvl w:ilvl="7" w:tentative="1">
+      <w:start w:val="1"/>
+      <w:numFmt w:val="bullet"/>
+      <w:lvlText w:val=""/>
+      <w:lvlJc w:val="left"/>
+      <w:pPr>
+        <w:tabs>
+          <w:tab w:val="num" w:pos="5760"/>
+        </w:tabs>
+        <w:ind w:left="5760" w:hanging="360"/>
+      </w:pPr>
+      <w:rPr>
+        <w:rFonts w:ascii="Wingdings" w:hAnsi="Wingdings" w:hint="default"/>
+        <w:sz w:val="20"/>
+      </w:rPr>
+    </w:lvl>
+    <w:lvl w:ilvl="8" w:tentative="1">
+      <w:start w:val="1"/>
+      <w:numFmt w:val="bullet"/>
+      <w:lvlText w:val=""/>
+      <w:lvlJc w:val="left"/>
+      <w:pPr>
+        <w:tabs>
+          <w:tab w:val="num" w:pos="6480"/>
+        </w:tabs>
+        <w:ind w:left="6480" w:hanging="360"/>
+      </w:pPr>
+      <w:rPr>
+        <w:rFonts w:ascii="Wingdings" w:hAnsi="Wingdings" w:hint="default"/>
+        <w:sz w:val="20"/>
+      </w:rPr>
+    </w:lvl>
+  </w:abstractNum>
+  <w:abstractNum w:abstractNumId="6" w15:restartNumberingAfterBreak="0">
+    <w:nsid w:val="36547CE2"/>
+    <w:multiLevelType w:val="multilevel"/>
+    <w:tmpl w:val="A0C2C524"/>
+    <w:lvl w:ilvl="0">
+      <w:start w:val="1"/>
+      <w:numFmt w:val="bullet"/>
+      <w:lvlText w:val=""/>
+      <w:lvlJc w:val="left"/>
+      <w:pPr>
+        <w:tabs>
+          <w:tab w:val="num" w:pos="720"/>
+        </w:tabs>
+        <w:ind w:left="720" w:hanging="360"/>
+      </w:pPr>
+      <w:rPr>
+        <w:rFonts w:ascii="Symbol" w:hAnsi="Symbol" w:hint="default"/>
+        <w:sz w:val="20"/>
+      </w:rPr>
+    </w:lvl>
+    <w:lvl w:ilvl="1" w:tentative="1">
+      <w:start w:val="1"/>
+      <w:numFmt w:val="bullet"/>
+      <w:lvlText w:val="o"/>
+      <w:lvlJc w:val="left"/>
+      <w:pPr>
+        <w:tabs>
+          <w:tab w:val="num" w:pos="1440"/>
+        </w:tabs>
+        <w:ind w:left="1440" w:hanging="360"/>
+      </w:pPr>
+      <w:rPr>
+        <w:rFonts w:ascii="Courier New" w:hAnsi="Courier New" w:hint="default"/>
+        <w:sz w:val="20"/>
+      </w:rPr>
+    </w:lvl>
+    <w:lvl w:ilvl="2" w:tentative="1">
+      <w:start w:val="1"/>
+      <w:numFmt w:val="bullet"/>
+      <w:lvlText w:val=""/>
+      <w:lvlJc w:val="left"/>
+      <w:pPr>
+        <w:tabs>
+          <w:tab w:val="num" w:pos="2160"/>
+        </w:tabs>
+        <w:ind w:left="2160" w:hanging="360"/>
+      </w:pPr>
+      <w:rPr>
+        <w:rFonts w:ascii="Wingdings" w:hAnsi="Wingdings" w:hint="default"/>
+        <w:sz w:val="20"/>
+      </w:rPr>
+    </w:lvl>
+    <w:lvl w:ilvl="3" w:tentative="1">
+      <w:start w:val="1"/>
+      <w:numFmt w:val="bullet"/>
+      <w:lvlText w:val=""/>
+      <w:lvlJc w:val="left"/>
+      <w:pPr>
+        <w:tabs>
+          <w:tab w:val="num" w:pos="2880"/>
+        </w:tabs>
+        <w:ind w:left="2880" w:hanging="360"/>
+      </w:pPr>
+      <w:rPr>
+        <w:rFonts w:ascii="Wingdings" w:hAnsi="Wingdings" w:hint="default"/>
+        <w:sz w:val="20"/>
+      </w:rPr>
+    </w:lvl>
+    <w:lvl w:ilvl="4" w:tentative="1">
+      <w:start w:val="1"/>
+      <w:numFmt w:val="bullet"/>
+      <w:lvlText w:val=""/>
+      <w:lvlJc w:val="left"/>
+      <w:pPr>
+        <w:tabs>
+          <w:tab w:val="num" w:pos="3600"/>
+        </w:tabs>
+        <w:ind w:left="3600" w:hanging="360"/>
+      </w:pPr>
+      <w:rPr>
+        <w:rFonts w:ascii="Wingdings" w:hAnsi="Wingdings" w:hint="default"/>
+        <w:sz w:val="20"/>
+      </w:rPr>
+    </w:lvl>
+    <w:lvl w:ilvl="5" w:tentative="1">
+      <w:start w:val="1"/>
+      <w:numFmt w:val="bullet"/>
+      <w:lvlText w:val=""/>
+      <w:lvlJc w:val="left"/>
+      <w:pPr>
+        <w:tabs>
+          <w:tab w:val="num" w:pos="4320"/>
+        </w:tabs>
+        <w:ind w:left="4320" w:hanging="360"/>
+      </w:pPr>
+      <w:rPr>
+        <w:rFonts w:ascii="Wingdings" w:hAnsi="Wingdings" w:hint="default"/>
+        <w:sz w:val="20"/>
+      </w:rPr>
+    </w:lvl>
+    <w:lvl w:ilvl="6" w:tentative="1">
+      <w:start w:val="1"/>
+      <w:numFmt w:val="bullet"/>
+      <w:lvlText w:val=""/>
+      <w:lvlJc w:val="left"/>
+      <w:pPr>
+        <w:tabs>
+          <w:tab w:val="num" w:pos="5040"/>
+        </w:tabs>
+        <w:ind w:left="5040" w:hanging="360"/>
+      </w:pPr>
+      <w:rPr>
+        <w:rFonts w:ascii="Wingdings" w:hAnsi="Wingdings" w:hint="default"/>
+        <w:sz w:val="20"/>
+      </w:rPr>
+    </w:lvl>
+    <w:lvl w:ilvl="7" w:tentative="1">
+      <w:start w:val="1"/>
+      <w:numFmt w:val="bullet"/>
+      <w:lvlText w:val=""/>
+      <w:lvlJc w:val="left"/>
+      <w:pPr>
+        <w:tabs>
+          <w:tab w:val="num" w:pos="5760"/>
+        </w:tabs>
+        <w:ind w:left="5760" w:hanging="360"/>
+      </w:pPr>
+      <w:rPr>
+        <w:rFonts w:ascii="Wingdings" w:hAnsi="Wingdings" w:hint="default"/>
+        <w:sz w:val="20"/>
+      </w:rPr>
+    </w:lvl>
+    <w:lvl w:ilvl="8" w:tentative="1">
+      <w:start w:val="1"/>
+      <w:numFmt w:val="bullet"/>
+      <w:lvlText w:val=""/>
+      <w:lvlJc w:val="left"/>
+      <w:pPr>
+        <w:tabs>
+          <w:tab w:val="num" w:pos="6480"/>
+        </w:tabs>
+        <w:ind w:left="6480" w:hanging="360"/>
+      </w:pPr>
+      <w:rPr>
+        <w:rFonts w:ascii="Wingdings" w:hAnsi="Wingdings" w:hint="default"/>
+        <w:sz w:val="20"/>
+      </w:rPr>
+    </w:lvl>
+  </w:abstractNum>
+  <w:abstractNum w:abstractNumId="7" w15:restartNumberingAfterBreak="0">
     <w:nsid w:val="45F921A8"/>
     <w:multiLevelType w:val="multilevel"/>
     <w:tmpl w:val="DD36DC14"/>
@@ -727,14 +2208,485 @@
       </w:rPr>
     </w:lvl>
   </w:abstractNum>
+  <w:abstractNum w:abstractNumId="8" w15:restartNumberingAfterBreak="0">
+    <w:nsid w:val="47DA3A33"/>
+    <w:multiLevelType w:val="multilevel"/>
+    <w:tmpl w:val="DD42B726"/>
+    <w:lvl w:ilvl="0">
+      <w:start w:val="1"/>
+      <w:numFmt w:val="bullet"/>
+      <w:lvlText w:val=""/>
+      <w:lvlJc w:val="left"/>
+      <w:pPr>
+        <w:tabs>
+          <w:tab w:val="num" w:pos="720"/>
+        </w:tabs>
+        <w:ind w:left="720" w:hanging="360"/>
+      </w:pPr>
+      <w:rPr>
+        <w:rFonts w:ascii="Symbol" w:hAnsi="Symbol" w:hint="default"/>
+        <w:sz w:val="20"/>
+      </w:rPr>
+    </w:lvl>
+    <w:lvl w:ilvl="1">
+      <w:start w:val="1"/>
+      <w:numFmt w:val="bullet"/>
+      <w:lvlText w:val="o"/>
+      <w:lvlJc w:val="left"/>
+      <w:pPr>
+        <w:tabs>
+          <w:tab w:val="num" w:pos="1440"/>
+        </w:tabs>
+        <w:ind w:left="1440" w:hanging="360"/>
+      </w:pPr>
+      <w:rPr>
+        <w:rFonts w:ascii="Courier New" w:hAnsi="Courier New" w:hint="default"/>
+        <w:sz w:val="20"/>
+      </w:rPr>
+    </w:lvl>
+    <w:lvl w:ilvl="2" w:tentative="1">
+      <w:start w:val="1"/>
+      <w:numFmt w:val="bullet"/>
+      <w:lvlText w:val=""/>
+      <w:lvlJc w:val="left"/>
+      <w:pPr>
+        <w:tabs>
+          <w:tab w:val="num" w:pos="2160"/>
+        </w:tabs>
+        <w:ind w:left="2160" w:hanging="360"/>
+      </w:pPr>
+      <w:rPr>
+        <w:rFonts w:ascii="Wingdings" w:hAnsi="Wingdings" w:hint="default"/>
+        <w:sz w:val="20"/>
+      </w:rPr>
+    </w:lvl>
+    <w:lvl w:ilvl="3" w:tentative="1">
+      <w:start w:val="1"/>
+      <w:numFmt w:val="bullet"/>
+      <w:lvlText w:val=""/>
+      <w:lvlJc w:val="left"/>
+      <w:pPr>
+        <w:tabs>
+          <w:tab w:val="num" w:pos="2880"/>
+        </w:tabs>
+        <w:ind w:left="2880" w:hanging="360"/>
+      </w:pPr>
+      <w:rPr>
+        <w:rFonts w:ascii="Wingdings" w:hAnsi="Wingdings" w:hint="default"/>
+        <w:sz w:val="20"/>
+      </w:rPr>
+    </w:lvl>
+    <w:lvl w:ilvl="4" w:tentative="1">
+      <w:start w:val="1"/>
+      <w:numFmt w:val="bullet"/>
+      <w:lvlText w:val=""/>
+      <w:lvlJc w:val="left"/>
+      <w:pPr>
+        <w:tabs>
+          <w:tab w:val="num" w:pos="3600"/>
+        </w:tabs>
+        <w:ind w:left="3600" w:hanging="360"/>
+      </w:pPr>
+      <w:rPr>
+        <w:rFonts w:ascii="Wingdings" w:hAnsi="Wingdings" w:hint="default"/>
+        <w:sz w:val="20"/>
+      </w:rPr>
+    </w:lvl>
+    <w:lvl w:ilvl="5" w:tentative="1">
+      <w:start w:val="1"/>
+      <w:numFmt w:val="bullet"/>
+      <w:lvlText w:val=""/>
+      <w:lvlJc w:val="left"/>
+      <w:pPr>
+        <w:tabs>
+          <w:tab w:val="num" w:pos="4320"/>
+        </w:tabs>
+        <w:ind w:left="4320" w:hanging="360"/>
+      </w:pPr>
+      <w:rPr>
+        <w:rFonts w:ascii="Wingdings" w:hAnsi="Wingdings" w:hint="default"/>
+        <w:sz w:val="20"/>
+      </w:rPr>
+    </w:lvl>
+    <w:lvl w:ilvl="6" w:tentative="1">
+      <w:start w:val="1"/>
+      <w:numFmt w:val="bullet"/>
+      <w:lvlText w:val=""/>
+      <w:lvlJc w:val="left"/>
+      <w:pPr>
+        <w:tabs>
+          <w:tab w:val="num" w:pos="5040"/>
+        </w:tabs>
+        <w:ind w:left="5040" w:hanging="360"/>
+      </w:pPr>
+      <w:rPr>
+        <w:rFonts w:ascii="Wingdings" w:hAnsi="Wingdings" w:hint="default"/>
+        <w:sz w:val="20"/>
+      </w:rPr>
+    </w:lvl>
+    <w:lvl w:ilvl="7" w:tentative="1">
+      <w:start w:val="1"/>
+      <w:numFmt w:val="bullet"/>
+      <w:lvlText w:val=""/>
+      <w:lvlJc w:val="left"/>
+      <w:pPr>
+        <w:tabs>
+          <w:tab w:val="num" w:pos="5760"/>
+        </w:tabs>
+        <w:ind w:left="5760" w:hanging="360"/>
+      </w:pPr>
+      <w:rPr>
+        <w:rFonts w:ascii="Wingdings" w:hAnsi="Wingdings" w:hint="default"/>
+        <w:sz w:val="20"/>
+      </w:rPr>
+    </w:lvl>
+    <w:lvl w:ilvl="8" w:tentative="1">
+      <w:start w:val="1"/>
+      <w:numFmt w:val="bullet"/>
+      <w:lvlText w:val=""/>
+      <w:lvlJc w:val="left"/>
+      <w:pPr>
+        <w:tabs>
+          <w:tab w:val="num" w:pos="6480"/>
+        </w:tabs>
+        <w:ind w:left="6480" w:hanging="360"/>
+      </w:pPr>
+      <w:rPr>
+        <w:rFonts w:ascii="Wingdings" w:hAnsi="Wingdings" w:hint="default"/>
+        <w:sz w:val="20"/>
+      </w:rPr>
+    </w:lvl>
+  </w:abstractNum>
+  <w:abstractNum w:abstractNumId="9" w15:restartNumberingAfterBreak="0">
+    <w:nsid w:val="5B424478"/>
+    <w:multiLevelType w:val="multilevel"/>
+    <w:tmpl w:val="EC3AECD8"/>
+    <w:lvl w:ilvl="0">
+      <w:start w:val="1"/>
+      <w:numFmt w:val="bullet"/>
+      <w:lvlText w:val=""/>
+      <w:lvlJc w:val="left"/>
+      <w:pPr>
+        <w:tabs>
+          <w:tab w:val="num" w:pos="720"/>
+        </w:tabs>
+        <w:ind w:left="720" w:hanging="360"/>
+      </w:pPr>
+      <w:rPr>
+        <w:rFonts w:ascii="Symbol" w:hAnsi="Symbol" w:hint="default"/>
+        <w:sz w:val="20"/>
+      </w:rPr>
+    </w:lvl>
+    <w:lvl w:ilvl="1" w:tentative="1">
+      <w:start w:val="1"/>
+      <w:numFmt w:val="bullet"/>
+      <w:lvlText w:val="o"/>
+      <w:lvlJc w:val="left"/>
+      <w:pPr>
+        <w:tabs>
+          <w:tab w:val="num" w:pos="1440"/>
+        </w:tabs>
+        <w:ind w:left="1440" w:hanging="360"/>
+      </w:pPr>
+      <w:rPr>
+        <w:rFonts w:ascii="Courier New" w:hAnsi="Courier New" w:hint="default"/>
+        <w:sz w:val="20"/>
+      </w:rPr>
+    </w:lvl>
+    <w:lvl w:ilvl="2" w:tentative="1">
+      <w:start w:val="1"/>
+      <w:numFmt w:val="bullet"/>
+      <w:lvlText w:val=""/>
+      <w:lvlJc w:val="left"/>
+      <w:pPr>
+        <w:tabs>
+          <w:tab w:val="num" w:pos="2160"/>
+        </w:tabs>
+        <w:ind w:left="2160" w:hanging="360"/>
+      </w:pPr>
+      <w:rPr>
+        <w:rFonts w:ascii="Wingdings" w:hAnsi="Wingdings" w:hint="default"/>
+        <w:sz w:val="20"/>
+      </w:rPr>
+    </w:lvl>
+    <w:lvl w:ilvl="3" w:tentative="1">
+      <w:start w:val="1"/>
+      <w:numFmt w:val="bullet"/>
+      <w:lvlText w:val=""/>
+      <w:lvlJc w:val="left"/>
+      <w:pPr>
+        <w:tabs>
+          <w:tab w:val="num" w:pos="2880"/>
+        </w:tabs>
+        <w:ind w:left="2880" w:hanging="360"/>
+      </w:pPr>
+      <w:rPr>
+        <w:rFonts w:ascii="Wingdings" w:hAnsi="Wingdings" w:hint="default"/>
+        <w:sz w:val="20"/>
+      </w:rPr>
+    </w:lvl>
+    <w:lvl w:ilvl="4" w:tentative="1">
+      <w:start w:val="1"/>
+      <w:numFmt w:val="bullet"/>
+      <w:lvlText w:val=""/>
+      <w:lvlJc w:val="left"/>
+      <w:pPr>
+        <w:tabs>
+          <w:tab w:val="num" w:pos="3600"/>
+        </w:tabs>
+        <w:ind w:left="3600" w:hanging="360"/>
+      </w:pPr>
+      <w:rPr>
+        <w:rFonts w:ascii="Wingdings" w:hAnsi="Wingdings" w:hint="default"/>
+        <w:sz w:val="20"/>
+      </w:rPr>
+    </w:lvl>
+    <w:lvl w:ilvl="5" w:tentative="1">
+      <w:start w:val="1"/>
+      <w:numFmt w:val="bullet"/>
+      <w:lvlText w:val=""/>
+      <w:lvlJc w:val="left"/>
+      <w:pPr>
+        <w:tabs>
+          <w:tab w:val="num" w:pos="4320"/>
+        </w:tabs>
+        <w:ind w:left="4320" w:hanging="360"/>
+      </w:pPr>
+      <w:rPr>
+        <w:rFonts w:ascii="Wingdings" w:hAnsi="Wingdings" w:hint="default"/>
+        <w:sz w:val="20"/>
+      </w:rPr>
+    </w:lvl>
+    <w:lvl w:ilvl="6" w:tentative="1">
+      <w:start w:val="1"/>
+      <w:numFmt w:val="bullet"/>
+      <w:lvlText w:val=""/>
+      <w:lvlJc w:val="left"/>
+      <w:pPr>
+        <w:tabs>
+          <w:tab w:val="num" w:pos="5040"/>
+        </w:tabs>
+        <w:ind w:left="5040" w:hanging="360"/>
+      </w:pPr>
+      <w:rPr>
+        <w:rFonts w:ascii="Wingdings" w:hAnsi="Wingdings" w:hint="default"/>
+        <w:sz w:val="20"/>
+      </w:rPr>
+    </w:lvl>
+    <w:lvl w:ilvl="7" w:tentative="1">
+      <w:start w:val="1"/>
+      <w:numFmt w:val="bullet"/>
+      <w:lvlText w:val=""/>
+      <w:lvlJc w:val="left"/>
+      <w:pPr>
+        <w:tabs>
+          <w:tab w:val="num" w:pos="5760"/>
+        </w:tabs>
+        <w:ind w:left="5760" w:hanging="360"/>
+      </w:pPr>
+      <w:rPr>
+        <w:rFonts w:ascii="Wingdings" w:hAnsi="Wingdings" w:hint="default"/>
+        <w:sz w:val="20"/>
+      </w:rPr>
+    </w:lvl>
+    <w:lvl w:ilvl="8" w:tentative="1">
+      <w:start w:val="1"/>
+      <w:numFmt w:val="bullet"/>
+      <w:lvlText w:val=""/>
+      <w:lvlJc w:val="left"/>
+      <w:pPr>
+        <w:tabs>
+          <w:tab w:val="num" w:pos="6480"/>
+        </w:tabs>
+        <w:ind w:left="6480" w:hanging="360"/>
+      </w:pPr>
+      <w:rPr>
+        <w:rFonts w:ascii="Wingdings" w:hAnsi="Wingdings" w:hint="default"/>
+        <w:sz w:val="20"/>
+      </w:rPr>
+    </w:lvl>
+  </w:abstractNum>
+  <w:abstractNum w:abstractNumId="10" w15:restartNumberingAfterBreak="0">
+    <w:nsid w:val="7FCD3709"/>
+    <w:multiLevelType w:val="multilevel"/>
+    <w:tmpl w:val="31A29190"/>
+    <w:lvl w:ilvl="0">
+      <w:start w:val="1"/>
+      <w:numFmt w:val="bullet"/>
+      <w:lvlText w:val=""/>
+      <w:lvlJc w:val="left"/>
+      <w:pPr>
+        <w:tabs>
+          <w:tab w:val="num" w:pos="720"/>
+        </w:tabs>
+        <w:ind w:left="720" w:hanging="360"/>
+      </w:pPr>
+      <w:rPr>
+        <w:rFonts w:ascii="Symbol" w:hAnsi="Symbol" w:hint="default"/>
+        <w:sz w:val="20"/>
+      </w:rPr>
+    </w:lvl>
+    <w:lvl w:ilvl="1" w:tentative="1">
+      <w:start w:val="1"/>
+      <w:numFmt w:val="bullet"/>
+      <w:lvlText w:val="o"/>
+      <w:lvlJc w:val="left"/>
+      <w:pPr>
+        <w:tabs>
+          <w:tab w:val="num" w:pos="1440"/>
+        </w:tabs>
+        <w:ind w:left="1440" w:hanging="360"/>
+      </w:pPr>
+      <w:rPr>
+        <w:rFonts w:ascii="Courier New" w:hAnsi="Courier New" w:hint="default"/>
+        <w:sz w:val="20"/>
+      </w:rPr>
+    </w:lvl>
+    <w:lvl w:ilvl="2" w:tentative="1">
+      <w:start w:val="1"/>
+      <w:numFmt w:val="bullet"/>
+      <w:lvlText w:val=""/>
+      <w:lvlJc w:val="left"/>
+      <w:pPr>
+        <w:tabs>
+          <w:tab w:val="num" w:pos="2160"/>
+        </w:tabs>
+        <w:ind w:left="2160" w:hanging="360"/>
+      </w:pPr>
+      <w:rPr>
+        <w:rFonts w:ascii="Wingdings" w:hAnsi="Wingdings" w:hint="default"/>
+        <w:sz w:val="20"/>
+      </w:rPr>
+    </w:lvl>
+    <w:lvl w:ilvl="3" w:tentative="1">
+      <w:start w:val="1"/>
+      <w:numFmt w:val="bullet"/>
+      <w:lvlText w:val=""/>
+      <w:lvlJc w:val="left"/>
+      <w:pPr>
+        <w:tabs>
+          <w:tab w:val="num" w:pos="2880"/>
+        </w:tabs>
+        <w:ind w:left="2880" w:hanging="360"/>
+      </w:pPr>
+      <w:rPr>
+        <w:rFonts w:ascii="Wingdings" w:hAnsi="Wingdings" w:hint="default"/>
+        <w:sz w:val="20"/>
+      </w:rPr>
+    </w:lvl>
+    <w:lvl w:ilvl="4" w:tentative="1">
+      <w:start w:val="1"/>
+      <w:numFmt w:val="bullet"/>
+      <w:lvlText w:val=""/>
+      <w:lvlJc w:val="left"/>
+      <w:pPr>
+        <w:tabs>
+          <w:tab w:val="num" w:pos="3600"/>
+        </w:tabs>
+        <w:ind w:left="3600" w:hanging="360"/>
+      </w:pPr>
+      <w:rPr>
+        <w:rFonts w:ascii="Wingdings" w:hAnsi="Wingdings" w:hint="default"/>
+        <w:sz w:val="20"/>
+      </w:rPr>
+    </w:lvl>
+    <w:lvl w:ilvl="5" w:tentative="1">
+      <w:start w:val="1"/>
+      <w:numFmt w:val="bullet"/>
+      <w:lvlText w:val=""/>
+      <w:lvlJc w:val="left"/>
+      <w:pPr>
+        <w:tabs>
+          <w:tab w:val="num" w:pos="4320"/>
+        </w:tabs>
+        <w:ind w:left="4320" w:hanging="360"/>
+      </w:pPr>
+      <w:rPr>
+        <w:rFonts w:ascii="Wingdings" w:hAnsi="Wingdings" w:hint="default"/>
+        <w:sz w:val="20"/>
+      </w:rPr>
+    </w:lvl>
+    <w:lvl w:ilvl="6" w:tentative="1">
+      <w:start w:val="1"/>
+      <w:numFmt w:val="bullet"/>
+      <w:lvlText w:val=""/>
+      <w:lvlJc w:val="left"/>
+      <w:pPr>
+        <w:tabs>
+          <w:tab w:val="num" w:pos="5040"/>
+        </w:tabs>
+        <w:ind w:left="5040" w:hanging="360"/>
+      </w:pPr>
+      <w:rPr>
+        <w:rFonts w:ascii="Wingdings" w:hAnsi="Wingdings" w:hint="default"/>
+        <w:sz w:val="20"/>
+      </w:rPr>
+    </w:lvl>
+    <w:lvl w:ilvl="7" w:tentative="1">
+      <w:start w:val="1"/>
+      <w:numFmt w:val="bullet"/>
+      <w:lvlText w:val=""/>
+      <w:lvlJc w:val="left"/>
+      <w:pPr>
+        <w:tabs>
+          <w:tab w:val="num" w:pos="5760"/>
+        </w:tabs>
+        <w:ind w:left="5760" w:hanging="360"/>
+      </w:pPr>
+      <w:rPr>
+        <w:rFonts w:ascii="Wingdings" w:hAnsi="Wingdings" w:hint="default"/>
+        <w:sz w:val="20"/>
+      </w:rPr>
+    </w:lvl>
+    <w:lvl w:ilvl="8" w:tentative="1">
+      <w:start w:val="1"/>
+      <w:numFmt w:val="bullet"/>
+      <w:lvlText w:val=""/>
+      <w:lvlJc w:val="left"/>
+      <w:pPr>
+        <w:tabs>
+          <w:tab w:val="num" w:pos="6480"/>
+        </w:tabs>
+        <w:ind w:left="6480" w:hanging="360"/>
+      </w:pPr>
+      <w:rPr>
+        <w:rFonts w:ascii="Wingdings" w:hAnsi="Wingdings" w:hint="default"/>
+        <w:sz w:val="20"/>
+      </w:rPr>
+    </w:lvl>
+  </w:abstractNum>
   <w:num w:numId="1" w16cid:durableId="1075739706">
-    <w:abstractNumId w:val="1"/>
+    <w:abstractNumId w:val="4"/>
   </w:num>
   <w:num w:numId="2" w16cid:durableId="1663193788">
+    <w:abstractNumId w:val="2"/>
+  </w:num>
+  <w:num w:numId="3" w16cid:durableId="1066494052">
+    <w:abstractNumId w:val="7"/>
+  </w:num>
+  <w:num w:numId="4" w16cid:durableId="1308777271">
+    <w:abstractNumId w:val="8"/>
+  </w:num>
+  <w:num w:numId="5" w16cid:durableId="462890527">
+    <w:abstractNumId w:val="3"/>
+  </w:num>
+  <w:num w:numId="6" w16cid:durableId="1328170295">
+    <w:abstractNumId w:val="5"/>
+  </w:num>
+  <w:num w:numId="7" w16cid:durableId="269432309">
     <w:abstractNumId w:val="0"/>
   </w:num>
-  <w:num w:numId="3" w16cid:durableId="1066494052">
-    <w:abstractNumId w:val="2"/>
+  <w:num w:numId="8" w16cid:durableId="1134983061">
+    <w:abstractNumId w:val="6"/>
+  </w:num>
+  <w:num w:numId="9" w16cid:durableId="1451054001">
+    <w:abstractNumId w:val="9"/>
+  </w:num>
+  <w:num w:numId="10" w16cid:durableId="1808470026">
+    <w:abstractNumId w:val="10"/>
+  </w:num>
+  <w:num w:numId="11" w16cid:durableId="469638289">
+    <w:abstractNumId w:val="1"/>
   </w:num>
 </w:numbering>
 </file>

</xml_diff>